<commit_message>
docs(anexos): nome oficial "em Inteligencia Artificial" e status pos-publicacao nos anexos e documentos do repositorio (LOG #78)
- Instrucoes A/B (pt e es) regeneradas: so 2 linhas mudam por arquivo (nome
  e status "aprovada em 16/09/2026 (Voto 25/2026) e publicada em 25/09/2026
  - em periodo de uso e teste pelos CEPs").
- Nota tecnica e suplemento (pt): nome na linha de edicao (so
  word/document.xml); es regenerados pelos mapas; roteiro es identico.
- LICENSE, README, CITATION.cff, package.json: nome oficial.
- Glossario: termoPtBr da entrada do nome atualizado; termoLocale ("en
  Inteligencia Artificial") aguarda o parecer do Z.

Co-Authored-By: Claude Opus 5.5 <noreply@anthropic.com>
Claude-Session: https://claude.ai/code/session_01EMCqDJHEYDPdwky1vKevpy
</commit_message>
<xml_diff>
--- a/public/instrucoes-preenchimento-versao-a-mariah-es.docx
+++ b/public/instrucoes-preenchimento-versao-a-mariah-es.docx
@@ -67,7 +67,7 @@
           <w:color w:val="555555"/>
           <w:sz w:val="19"/>
         </w:rPr>
-        <w:t>Matriz de Evaluación de Riesgo de Inteligencia Artificial en Investigación con Seres Humanos</w:t>
+        <w:t>Matriz de Evaluación de Riesgo en Inteligencia Artificial en Investigación con Seres Humanos</w:t>
       </w:r>
     </w:p>
     <w:p>
@@ -82,7 +82,7 @@
           <w:color w:val="555555"/>
           <w:sz w:val="17"/>
         </w:rPr>
-        <w:t>Documento generado a partir de la especificación canónica de la matriz (v2). Versión aprobada por la INAEP el 16/09/2026 — en revisión editorial para su publicación.</w:t>
+        <w:t>Documento generado a partir de la especificación canónica de la matriz (v2). Versión aprobada por la INAEP el 16/09/2026 (Voto n.º 25/2026) y publicada el 25/09/2026 — en período de uso y prueba por los CEPs.</w:t>
       </w:r>
     </w:p>
     <w:p>

</xml_diff>